<commit_message>
Framework V7.4 governing; Framework and RCF cite Completion Standard V1.4
Retire the draft status block on Framework V7.4 (per the S6.1 promotion
decision) and repoint the Completion Standard citations in the Framework and
RCF V3.2 to the current standard.

Co-Authored-By: Claude Sonnet 5.5 <noreply@anthropic.com>
Claude-Session: https://claude.ai/code/session_01L5xhWKCzK96CZGy1fPzqGp
</commit_message>
<xml_diff>
--- a/Build/reference/L3B-World-Build-Methodology/CiC_L3B_Formation_World_Construction_Framework_V7.4.docx
+++ b/Build/reference/L3B-World-Build-Methodology/CiC_L3B_Formation_World_Construction_Framework_V7.4.docx
@@ -36,7 +36,7 @@
         <w:spacing w:after="180"/>
       </w:pPr>
       <w:r>
-        <w:t xml:space="preserve">DRAFT — pending Opus deep review and project-lead review; not yet ratified. Built on the main-branch V7.3 baseline, folding forward process-discipline lessons confirmed during the CiC-Fable-Experiment build cycle (all five formation worlds), then substantially reworked on the project lead's own direction to combine source-ecology and source-registry work into a single Step 2 built for a roughly forty-world scale rather than a five-world patch. Most changes are additive; Step 2 itself was restructured (a briefly-added separate "Step 2B" was merged back into Step 2 rather than kept as a distinct later step) — see Step 2's own text for the reasoning. [Addendum, 2026-08-05, full-system review Rigor P0-2/P1-9: six worlds have frozen against this document as though it were governing, while it has sat DRAFT/not-yet-ratified since it was written — the practical situation the Record Integrity Principle exists to prevent, now applied to this document's own status. The Freeze Criteria's Article 31 bullet below is corrected in this same pass to match the project lead's actual 2026-08-02 ruling. Ratifying this document outright remains the project lead's own decision, not taken here — flagged directly rather than assumed.]</w:t>
+        <w:t xml:space="preserve">This is the governing Formation World Construction Framework. Freeze requirements live in the governing Completion Standard V1.4.</w:t>
       </w:r>
     </w:p>
     <w:p>
@@ -6524,15 +6524,15 @@
         <w:spacing w:after="180"/>
       </w:pPr>
       <w:r>
-        <w:t xml:space="preserve">Representative-freeze — after world-freeze, the Representative may freeze when: representative voices are accountable and appropriately grounded (per CO-014), and encounter testing is successful — run as the governing Completion Standard V1.0 section C specifies: RCF Part Eight’s probe categories plus the parroting and pushback categories under the Validation Protocol Rigor discipline above, continuity regression against the prior version where one exists, and the Table Readiness Round passed, with findings routed (a) runtime, (b) records, or (c) framework change, and (b)/(c) closed or explicitly accepted before freeze.</w:t>
-      </w:r>
-    </w:p>
-    <w:p>
-      <w:pPr>
-        <w:spacing w:after="180"/>
-      </w:pPr>
-      <w:r>
-        <w:t xml:space="preserve">The authoritative requirements tables for both freezes live in the governing Completion Standard V1.0 (Ministry/Technology/CiC_World_Build_Completion_Standard_V1.0.md); this section names the split and defers the detail there.</w:t>
+        <w:t xml:space="preserve">Representative-freeze — after world-freeze, the Representative may freeze when: representative voices are accountable and appropriately grounded (per CO-014), and encounter testing is successful — run as the governing Completion Standard V1.4 section C specifies: RCF Part Eight’s probe categories plus the parroting and pushback categories under the Validation Protocol Rigor discipline above, continuity regression against the prior version where one exists, and the Table Readiness Round passed, with findings routed (a) runtime, (b) records, or (c) framework change, and (b)/(c) closed or explicitly accepted before freeze.</w:t>
+      </w:r>
+    </w:p>
+    <w:p>
+      <w:pPr>
+        <w:spacing w:after="180"/>
+      </w:pPr>
+      <w:r>
+        <w:t xml:space="preserve">The authoritative requirements tables for both freezes live in the governing Completion Standard V1.4 (Build/reference/method/CiC_World_Build_Completion_Standard_V1.4.md); this section names the split and defers the detail there.</w:t>
       </w:r>
     </w:p>
     <w:p>
@@ -6983,7 +6983,7 @@
         <w:spacing w:after="60"/>
       </w:pPr>
       <w:r>
-        <w:t xml:space="preserve">Close the Registry with a saturation statement naming the last unproductive searches — which queries, against which instruments, returned nothing new. A Registry without a saturation statement is not complete: “we stopped finding new sources” is a claim, and it must name its evidence (Completion Standard V1.0, section A, source row).</w:t>
+        <w:t xml:space="preserve">Close the Registry with a saturation statement naming the last unproductive searches — which queries, against which instruments, returned nothing new. A Registry without a saturation statement is not complete: “we stopped finding new sources” is a claim, and it must name its evidence (Completion Standard V1.4, section A, source row).</w:t>
       </w:r>
     </w:p>
     <w:p>

</xml_diff>

<commit_message>
Apply the project lead's rulings: drop bare ruling numbers, Framework scope, B-8, two principles
Rules stay fully stated in place without ruling numbers. The Framework's
Validation Protocol Rigor scope names the lean default. Probe parity is single
trial on lean and two trials on full validation. The world-perspective and
right-answers-first principles are added. The classifier scope covers the
Adversarial Review practice, which keeps its own vocabulary. Decision log
records the resolutions.

Co-Authored-By: Claude Sonnet 5.5 <noreply@anthropic.com>
Claude-Session: https://claude.ai/code/session_01L5xhWKCzK96CZGy1fPzqGp
</commit_message>
<xml_diff>
--- a/Build/reference/L3B-World-Build-Methodology/CiC_L3B_Formation_World_Construction_Framework_V7.4.docx
+++ b/Build/reference/L3B-World-Build-Methodology/CiC_L3B_Formation_World_Construction_Framework_V7.4.docx
@@ -5914,6 +5914,14 @@
           <w:szCs w:val="24"/>
         </w:rPr>
         <w:t xml:space="preserve">Validation Protocol Rigor (governs every testing category below)</w:t>
+      </w:r>
+    </w:p>
+    <w:p>
+      <w:pPr>
+        <w:spacing w:after="180"/>
+      </w:pPr>
+      <w:r>
+        <w:t xml:space="preserve">For a Representative freeze, the lean default in the freeze criteria below applies; this protocol binds full validation and any report of “confirmed”, “clean” or “closed”.</w:t>
       </w:r>
     </w:p>
     <w:p>

</xml_diff>